<commit_message>
add white and black list
</commit_message>
<xml_diff>
--- a/Report.docx
+++ b/Report.docx
@@ -45,12 +45,14 @@
         </w:rPr>
         <w:t>，存入</w:t>
       </w:r>
+      <w:proofErr w:type="spellStart"/>
       <w:r>
         <w:rPr>
           <w:rFonts w:hint="eastAsia"/>
         </w:rPr>
         <w:t>faiss</w:t>
       </w:r>
+      <w:proofErr w:type="spellEnd"/>
       <w:r>
         <w:rPr>
           <w:rFonts w:hint="eastAsia"/>
@@ -118,9 +120,6 @@
     <w:p>
       <w:pPr>
         <w:ind w:left="720"/>
-        <w:rPr>
-          <w:rFonts w:hint="eastAsia"/>
-        </w:rPr>
       </w:pPr>
       <w:r>
         <w:rPr>
@@ -840,6 +839,7 @@
         </w:rPr>
         <w:t>计算</w:t>
       </w:r>
+      <w:proofErr w:type="gramStart"/>
       <w:r>
         <w:rPr>
           <w:rFonts w:hint="eastAsia"/>
@@ -855,12 +855,15 @@
         </w:rPr>
         <w:t>存入</w:t>
       </w:r>
+      <w:proofErr w:type="spellStart"/>
+      <w:proofErr w:type="gramEnd"/>
       <w:r>
         <w:rPr>
           <w:rFonts w:hint="eastAsia"/>
         </w:rPr>
         <w:t>faiss</w:t>
       </w:r>
+      <w:proofErr w:type="spellEnd"/>
       <w:r>
         <w:rPr>
           <w:rFonts w:hint="eastAsia"/>
@@ -1661,12 +1664,14 @@
         </w:rPr>
         <w:t>然后在意向专业子分类的</w:t>
       </w:r>
+      <w:proofErr w:type="spellStart"/>
       <w:r>
         <w:rPr>
           <w:rFonts w:hint="eastAsia"/>
         </w:rPr>
         <w:t>faiss</w:t>
       </w:r>
+      <w:proofErr w:type="spellEnd"/>
       <w:r>
         <w:rPr>
           <w:rFonts w:hint="eastAsia"/>
@@ -1720,12 +1725,14 @@
         </w:rPr>
         <w:t>，然后再意向专业大分类的</w:t>
       </w:r>
+      <w:proofErr w:type="spellStart"/>
       <w:r>
         <w:rPr>
           <w:rFonts w:hint="eastAsia"/>
         </w:rPr>
         <w:t>faiss</w:t>
       </w:r>
+      <w:proofErr w:type="spellEnd"/>
       <w:r>
         <w:rPr>
           <w:rFonts w:hint="eastAsia"/>
@@ -1895,14 +1902,7 @@
           <w:rFonts w:hint="eastAsia"/>
           <w:color w:val="000000" w:themeColor="text1"/>
         </w:rPr>
-        <w:t>是</w:t>
-      </w:r>
-      <w:r>
-        <w:rPr>
-          <w:rFonts w:hint="eastAsia"/>
-          <w:color w:val="000000" w:themeColor="text1"/>
-        </w:rPr>
-        <w:t>产品设计工程</w:t>
+        <w:t>是产品设计工程</w:t>
       </w:r>
       <w:r>
         <w:rPr>
@@ -2100,8 +2100,16 @@
         <w:rPr>
           <w:rFonts w:hint="eastAsia"/>
         </w:rPr>
-        <w:t>--Alevel</w:t>
-      </w:r>
+        <w:t>--</w:t>
+      </w:r>
+      <w:proofErr w:type="spellStart"/>
+      <w:r>
+        <w:rPr>
+          <w:rFonts w:hint="eastAsia"/>
+        </w:rPr>
+        <w:t>Alevel</w:t>
+      </w:r>
+      <w:proofErr w:type="spellEnd"/>
       <w:r>
         <w:rPr>
           <w:rFonts w:hint="eastAsia"/>
@@ -2189,7 +2197,27 @@
           <w:rFonts w:hint="eastAsia"/>
           <w:color w:val="FF0000"/>
         </w:rPr>
-        <w:t>向量搜索出来的对应专业小类为：</w:t>
+        <w:t>向量搜索出来的对应专业小类为</w:t>
+      </w:r>
+      <w:r>
+        <w:rPr>
+          <w:rFonts w:hint="eastAsia"/>
+          <w:color w:val="FF0000"/>
+        </w:rPr>
+        <w:t>(</w:t>
+      </w:r>
+      <w:r>
+        <w:rPr>
+          <w:color w:val="FF0000"/>
+        </w:rPr>
+        <w:t>embedding model1)</w:t>
+      </w:r>
+      <w:r>
+        <w:rPr>
+          <w:rFonts w:hint="eastAsia"/>
+          <w:color w:val="FF0000"/>
+        </w:rPr>
+        <w:t>：</w:t>
       </w:r>
       <w:r>
         <w:rPr>
@@ -2254,6 +2282,101 @@
           <w:color w:val="00B0F0"/>
         </w:rPr>
       </w:pPr>
+      <w:r>
+        <w:rPr>
+          <w:rFonts w:hint="eastAsia"/>
+          <w:color w:val="FF0000"/>
+        </w:rPr>
+        <w:t>向量搜索出来的对应专业小类为</w:t>
+      </w:r>
+      <w:r>
+        <w:rPr>
+          <w:rFonts w:hint="eastAsia"/>
+          <w:color w:val="FF0000"/>
+        </w:rPr>
+        <w:t>(</w:t>
+      </w:r>
+      <w:r>
+        <w:rPr>
+          <w:color w:val="FF0000"/>
+        </w:rPr>
+        <w:t>embedding model</w:t>
+      </w:r>
+      <w:r>
+        <w:rPr>
+          <w:color w:val="FF0000"/>
+        </w:rPr>
+        <w:t>2</w:t>
+      </w:r>
+      <w:r>
+        <w:rPr>
+          <w:color w:val="FF0000"/>
+        </w:rPr>
+        <w:t>)</w:t>
+      </w:r>
+      <w:r>
+        <w:rPr>
+          <w:rFonts w:hint="eastAsia"/>
+          <w:color w:val="FF0000"/>
+        </w:rPr>
+        <w:t>：</w:t>
+      </w:r>
+      <w:r>
+        <w:rPr>
+          <w:rFonts w:hint="eastAsia"/>
+          <w:color w:val="00B0F0"/>
+        </w:rPr>
+        <w:t xml:space="preserve"> ['</w:t>
+      </w:r>
+      <w:r>
+        <w:rPr>
+          <w:rFonts w:hint="eastAsia"/>
+          <w:color w:val="00B0F0"/>
+        </w:rPr>
+        <w:t>会计与金融</w:t>
+      </w:r>
+      <w:r>
+        <w:rPr>
+          <w:rFonts w:hint="eastAsia"/>
+          <w:color w:val="00B0F0"/>
+        </w:rPr>
+        <w:t>', '</w:t>
+      </w:r>
+      <w:r>
+        <w:rPr>
+          <w:rFonts w:hint="eastAsia"/>
+          <w:color w:val="00B0F0"/>
+        </w:rPr>
+        <w:t>化学</w:t>
+      </w:r>
+      <w:r>
+        <w:rPr>
+          <w:rFonts w:hint="eastAsia"/>
+          <w:color w:val="00B0F0"/>
+        </w:rPr>
+        <w:t>', '</w:t>
+      </w:r>
+      <w:r>
+        <w:rPr>
+          <w:rFonts w:hint="eastAsia"/>
+          <w:color w:val="00B0F0"/>
+        </w:rPr>
+        <w:t>法律与法律研究</w:t>
+      </w:r>
+      <w:r>
+        <w:rPr>
+          <w:rFonts w:hint="eastAsia"/>
+          <w:color w:val="00B0F0"/>
+        </w:rPr>
+        <w:t>']</w:t>
+      </w:r>
+    </w:p>
+    <w:p>
+      <w:pPr>
+        <w:rPr>
+          <w:color w:val="00B0F0"/>
+        </w:rPr>
+      </w:pPr>
     </w:p>
     <w:p>
       <w:pPr>
@@ -2427,7 +2550,27 @@
           <w:rFonts w:hint="eastAsia"/>
           <w:color w:val="FF0000"/>
         </w:rPr>
-        <w:t>向量搜索出来的专业大类为：</w:t>
+        <w:t>向量搜索出来的专业大类为</w:t>
+      </w:r>
+      <w:r>
+        <w:rPr>
+          <w:rFonts w:hint="eastAsia"/>
+          <w:color w:val="FF0000"/>
+        </w:rPr>
+        <w:t>(</w:t>
+      </w:r>
+      <w:r>
+        <w:rPr>
+          <w:color w:val="FF0000"/>
+        </w:rPr>
+        <w:t>embedding model1)</w:t>
+      </w:r>
+      <w:r>
+        <w:rPr>
+          <w:rFonts w:hint="eastAsia"/>
+          <w:color w:val="FF0000"/>
+        </w:rPr>
+        <w:t>：</w:t>
       </w:r>
       <w:r>
         <w:rPr>
@@ -2490,7 +2633,238 @@
           <w:rFonts w:hint="eastAsia"/>
           <w:color w:val="FF0000"/>
         </w:rPr>
-        <w:t>向量搜索出来的专业小类为：</w:t>
+        <w:t>向量搜索出来的专业大类为</w:t>
+      </w:r>
+      <w:r>
+        <w:rPr>
+          <w:rFonts w:hint="eastAsia"/>
+          <w:color w:val="FF0000"/>
+        </w:rPr>
+        <w:t>(</w:t>
+      </w:r>
+      <w:r>
+        <w:rPr>
+          <w:color w:val="FF0000"/>
+        </w:rPr>
+        <w:t>embedding model</w:t>
+      </w:r>
+      <w:r>
+        <w:rPr>
+          <w:color w:val="FF0000"/>
+        </w:rPr>
+        <w:t>2</w:t>
+      </w:r>
+      <w:r>
+        <w:rPr>
+          <w:color w:val="FF0000"/>
+        </w:rPr>
+        <w:t>)</w:t>
+      </w:r>
+      <w:r>
+        <w:rPr>
+          <w:rFonts w:hint="eastAsia"/>
+          <w:color w:val="FF0000"/>
+        </w:rPr>
+        <w:t>：</w:t>
+      </w:r>
+      <w:r>
+        <w:rPr>
+          <w:rFonts w:hint="eastAsia"/>
+          <w:color w:val="00B0F0"/>
+        </w:rPr>
+        <w:t xml:space="preserve"> </w:t>
+      </w:r>
+      <w:r>
+        <w:rPr>
+          <w:rFonts w:hint="eastAsia"/>
+          <w:color w:val="00B0F0"/>
+        </w:rPr>
+        <w:t>['</w:t>
+      </w:r>
+      <w:r>
+        <w:rPr>
+          <w:rFonts w:hint="eastAsia"/>
+          <w:color w:val="00B0F0"/>
+        </w:rPr>
+        <w:t>艺术与设计</w:t>
+      </w:r>
+      <w:r>
+        <w:rPr>
+          <w:rFonts w:hint="eastAsia"/>
+          <w:color w:val="00B0F0"/>
+        </w:rPr>
+        <w:t>', '</w:t>
+      </w:r>
+      <w:r>
+        <w:rPr>
+          <w:rFonts w:hint="eastAsia"/>
+          <w:color w:val="00B0F0"/>
+        </w:rPr>
+        <w:t>音乐</w:t>
+      </w:r>
+      <w:r>
+        <w:rPr>
+          <w:rFonts w:hint="eastAsia"/>
+          <w:color w:val="00B0F0"/>
+        </w:rPr>
+        <w:t>', '</w:t>
+      </w:r>
+      <w:r>
+        <w:rPr>
+          <w:rFonts w:hint="eastAsia"/>
+          <w:color w:val="00B0F0"/>
+        </w:rPr>
+        <w:t>教育与培训</w:t>
+      </w:r>
+      <w:r>
+        <w:rPr>
+          <w:rFonts w:hint="eastAsia"/>
+          <w:color w:val="00B0F0"/>
+        </w:rPr>
+        <w:t>']</w:t>
+      </w:r>
+    </w:p>
+    <w:p>
+      <w:pPr>
+        <w:rPr>
+          <w:color w:val="00B0F0"/>
+        </w:rPr>
+      </w:pPr>
+    </w:p>
+    <w:p>
+      <w:pPr>
+        <w:rPr>
+          <w:color w:val="00B0F0"/>
+        </w:rPr>
+      </w:pPr>
+      <w:r>
+        <w:rPr>
+          <w:rFonts w:hint="eastAsia"/>
+          <w:color w:val="FF0000"/>
+        </w:rPr>
+        <w:t>向量搜索出来的专业小类为</w:t>
+      </w:r>
+      <w:r>
+        <w:rPr>
+          <w:rFonts w:hint="eastAsia"/>
+          <w:color w:val="FF0000"/>
+        </w:rPr>
+        <w:t>(</w:t>
+      </w:r>
+      <w:r>
+        <w:rPr>
+          <w:color w:val="FF0000"/>
+        </w:rPr>
+        <w:t>embedding mdoel1)</w:t>
+      </w:r>
+      <w:r>
+        <w:rPr>
+          <w:rFonts w:hint="eastAsia"/>
+          <w:color w:val="FF0000"/>
+        </w:rPr>
+        <w:t>：</w:t>
+      </w:r>
+      <w:r>
+        <w:rPr>
+          <w:rFonts w:hint="eastAsia"/>
+          <w:color w:val="00B0F0"/>
+        </w:rPr>
+        <w:t xml:space="preserve"> </w:t>
+      </w:r>
+      <w:r>
+        <w:rPr>
+          <w:rFonts w:hint="eastAsia"/>
+          <w:color w:val="00B0F0"/>
+        </w:rPr>
+        <w:t>['</w:t>
+      </w:r>
+      <w:r>
+        <w:rPr>
+          <w:rFonts w:hint="eastAsia"/>
+          <w:color w:val="00B0F0"/>
+        </w:rPr>
+        <w:t>艺术与设计</w:t>
+      </w:r>
+      <w:r>
+        <w:rPr>
+          <w:rFonts w:hint="eastAsia"/>
+          <w:color w:val="00B0F0"/>
+        </w:rPr>
+        <w:t>', '</w:t>
+      </w:r>
+      <w:r>
+        <w:rPr>
+          <w:rFonts w:hint="eastAsia"/>
+          <w:color w:val="00B0F0"/>
+        </w:rPr>
+        <w:t>音乐</w:t>
+      </w:r>
+      <w:r>
+        <w:rPr>
+          <w:rFonts w:hint="eastAsia"/>
+          <w:color w:val="00B0F0"/>
+        </w:rPr>
+        <w:t>', '</w:t>
+      </w:r>
+      <w:r>
+        <w:rPr>
+          <w:rFonts w:hint="eastAsia"/>
+          <w:color w:val="00B0F0"/>
+        </w:rPr>
+        <w:t>市场营销</w:t>
+      </w:r>
+      <w:r>
+        <w:rPr>
+          <w:rFonts w:hint="eastAsia"/>
+          <w:color w:val="00B0F0"/>
+        </w:rPr>
+        <w:t>']</w:t>
+      </w:r>
+    </w:p>
+    <w:p>
+      <w:pPr>
+        <w:rPr>
+          <w:color w:val="00B0F0"/>
+        </w:rPr>
+      </w:pPr>
+      <w:r>
+        <w:rPr>
+          <w:rFonts w:hint="eastAsia"/>
+          <w:color w:val="FF0000"/>
+        </w:rPr>
+        <w:t>向量搜索出来的专业小类为</w:t>
+      </w:r>
+      <w:r>
+        <w:rPr>
+          <w:rFonts w:hint="eastAsia"/>
+          <w:color w:val="FF0000"/>
+        </w:rPr>
+        <w:t>(</w:t>
+      </w:r>
+      <w:r>
+        <w:rPr>
+          <w:color w:val="FF0000"/>
+        </w:rPr>
+        <w:t>embedding mdoel</w:t>
+      </w:r>
+      <w:r>
+        <w:rPr>
+          <w:color w:val="FF0000"/>
+        </w:rPr>
+        <w:t>2</w:t>
+      </w:r>
+      <w:r>
+        <w:rPr>
+          <w:color w:val="FF0000"/>
+        </w:rPr>
+        <w:t>)</w:t>
+      </w:r>
+      <w:r>
+        <w:rPr>
+          <w:rFonts w:hint="eastAsia"/>
+          <w:color w:val="FF0000"/>
+        </w:rPr>
+        <w:t>：</w:t>
       </w:r>
       <w:r>
         <w:rPr>
@@ -2686,7 +3060,28 @@
           <w:rFonts w:hint="eastAsia"/>
           <w:color w:val="FF0000"/>
         </w:rPr>
-        <w:t>向量搜索出来的对应专业小类为：</w:t>
+        <w:lastRenderedPageBreak/>
+        <w:t>向量搜索出来的对应专业小类为</w:t>
+      </w:r>
+      <w:r>
+        <w:rPr>
+          <w:rFonts w:hint="eastAsia"/>
+          <w:color w:val="FF0000"/>
+        </w:rPr>
+        <w:t>(</w:t>
+      </w:r>
+      <w:r>
+        <w:rPr>
+          <w:color w:val="FF0000"/>
+        </w:rPr>
+        <w:t>embedding model1)</w:t>
+      </w:r>
+      <w:r>
+        <w:rPr>
+          <w:rFonts w:hint="eastAsia"/>
+          <w:color w:val="FF0000"/>
+        </w:rPr>
+        <w:t>：</w:t>
       </w:r>
       <w:r>
         <w:rPr>
@@ -2751,6 +3146,115 @@
           <w:color w:val="00B0F0"/>
         </w:rPr>
       </w:pPr>
+      <w:r>
+        <w:rPr>
+          <w:rFonts w:hint="eastAsia"/>
+          <w:color w:val="FF0000"/>
+        </w:rPr>
+        <w:t>向量搜索出来的对应专业小类为</w:t>
+      </w:r>
+      <w:r>
+        <w:rPr>
+          <w:rFonts w:hint="eastAsia"/>
+          <w:color w:val="FF0000"/>
+        </w:rPr>
+        <w:t>(</w:t>
+      </w:r>
+      <w:r>
+        <w:rPr>
+          <w:color w:val="FF0000"/>
+        </w:rPr>
+        <w:t>embedding model</w:t>
+      </w:r>
+      <w:r>
+        <w:rPr>
+          <w:color w:val="FF0000"/>
+        </w:rPr>
+        <w:t>2</w:t>
+      </w:r>
+      <w:r>
+        <w:rPr>
+          <w:color w:val="FF0000"/>
+        </w:rPr>
+        <w:t>)</w:t>
+      </w:r>
+      <w:r>
+        <w:rPr>
+          <w:rFonts w:hint="eastAsia"/>
+          <w:color w:val="FF0000"/>
+        </w:rPr>
+        <w:t>：</w:t>
+      </w:r>
+      <w:r>
+        <w:rPr>
+          <w:rFonts w:hint="eastAsia"/>
+          <w:color w:val="00B0F0"/>
+        </w:rPr>
+        <w:t xml:space="preserve"> </w:t>
+      </w:r>
+      <w:r>
+        <w:rPr>
+          <w:rFonts w:hint="eastAsia"/>
+          <w:color w:val="00B0F0"/>
+        </w:rPr>
+        <w:t>['</w:t>
+      </w:r>
+      <w:r>
+        <w:rPr>
+          <w:rFonts w:hint="eastAsia"/>
+          <w:color w:val="00B0F0"/>
+        </w:rPr>
+        <w:t>计算机科学与信息系统</w:t>
+      </w:r>
+      <w:r>
+        <w:rPr>
+          <w:rFonts w:hint="eastAsia"/>
+          <w:color w:val="00B0F0"/>
+        </w:rPr>
+        <w:t>', '</w:t>
+      </w:r>
+      <w:r>
+        <w:rPr>
+          <w:rFonts w:hint="eastAsia"/>
+          <w:color w:val="00B0F0"/>
+        </w:rPr>
+        <w:t>会计与金融</w:t>
+      </w:r>
+      <w:r>
+        <w:rPr>
+          <w:rFonts w:hint="eastAsia"/>
+          <w:color w:val="00B0F0"/>
+        </w:rPr>
+        <w:t>', '</w:t>
+      </w:r>
+      <w:r>
+        <w:rPr>
+          <w:rFonts w:hint="eastAsia"/>
+          <w:color w:val="00B0F0"/>
+        </w:rPr>
+        <w:t>数据科学和人工智能</w:t>
+      </w:r>
+      <w:r>
+        <w:rPr>
+          <w:rFonts w:hint="eastAsia"/>
+          <w:color w:val="00B0F0"/>
+        </w:rPr>
+        <w:t>']</w:t>
+      </w:r>
+    </w:p>
+    <w:p>
+      <w:pPr>
+        <w:rPr>
+          <w:color w:val="00B0F0"/>
+        </w:rPr>
+      </w:pPr>
+    </w:p>
+    <w:p>
+      <w:pPr>
+        <w:rPr>
+          <w:color w:val="00B0F0"/>
+        </w:rPr>
+      </w:pPr>
     </w:p>
     <w:p>
       <w:pPr>
@@ -2811,7 +3315,7 @@
     <w:p>
       <w:pPr>
         <w:rPr>
-          <w:color w:val="FF0000"/>
+          <w:color w:val="00B0F0"/>
         </w:rPr>
       </w:pPr>
       <w:r>
@@ -2833,7 +3337,27 @@
           <w:rFonts w:hint="eastAsia"/>
           <w:color w:val="FF0000"/>
         </w:rPr>
-        <w:t>类为：</w:t>
+        <w:t>类为</w:t>
+      </w:r>
+      <w:r>
+        <w:rPr>
+          <w:rFonts w:hint="eastAsia"/>
+          <w:color w:val="FF0000"/>
+        </w:rPr>
+        <w:t>(</w:t>
+      </w:r>
+      <w:r>
+        <w:rPr>
+          <w:color w:val="FF0000"/>
+        </w:rPr>
+        <w:t>embedding model1)</w:t>
+      </w:r>
+      <w:r>
+        <w:rPr>
+          <w:rFonts w:hint="eastAsia"/>
+          <w:color w:val="FF0000"/>
+        </w:rPr>
+        <w:t>：</w:t>
       </w:r>
       <w:r>
         <w:rPr>
@@ -2888,22 +3412,137 @@
     <w:p>
       <w:pPr>
         <w:rPr>
-          <w:color w:val="00B0F0"/>
-        </w:rPr>
-      </w:pPr>
-    </w:p>
-    <w:p>
-      <w:pPr>
-        <w:rPr>
-          <w:color w:val="00B0F0"/>
-        </w:rPr>
-      </w:pPr>
-      <w:r>
-        <w:rPr>
-          <w:rFonts w:hint="eastAsia"/>
-          <w:color w:val="FF0000"/>
-        </w:rPr>
-        <w:lastRenderedPageBreak/>
+          <w:color w:val="FF0000"/>
+        </w:rPr>
+      </w:pPr>
+      <w:r>
+        <w:rPr>
+          <w:rFonts w:hint="eastAsia"/>
+          <w:color w:val="FF0000"/>
+        </w:rPr>
+        <w:t>向量搜索出来的对应专业</w:t>
+      </w:r>
+      <w:r>
+        <w:rPr>
+          <w:rFonts w:hint="eastAsia"/>
+          <w:color w:val="FF0000"/>
+        </w:rPr>
+        <w:t>大</w:t>
+      </w:r>
+      <w:r>
+        <w:rPr>
+          <w:rFonts w:hint="eastAsia"/>
+          <w:color w:val="FF0000"/>
+        </w:rPr>
+        <w:t>类为</w:t>
+      </w:r>
+      <w:r>
+        <w:rPr>
+          <w:rFonts w:hint="eastAsia"/>
+          <w:color w:val="FF0000"/>
+        </w:rPr>
+        <w:t>(</w:t>
+      </w:r>
+      <w:r>
+        <w:rPr>
+          <w:color w:val="FF0000"/>
+        </w:rPr>
+        <w:t>embedding model</w:t>
+      </w:r>
+      <w:r>
+        <w:rPr>
+          <w:color w:val="FF0000"/>
+        </w:rPr>
+        <w:t>2</w:t>
+      </w:r>
+      <w:r>
+        <w:rPr>
+          <w:color w:val="FF0000"/>
+        </w:rPr>
+        <w:t>)</w:t>
+      </w:r>
+      <w:r>
+        <w:rPr>
+          <w:rFonts w:hint="eastAsia"/>
+          <w:color w:val="FF0000"/>
+        </w:rPr>
+        <w:t>：</w:t>
+      </w:r>
+      <w:r>
+        <w:rPr>
+          <w:rFonts w:hint="eastAsia"/>
+          <w:color w:val="00B0F0"/>
+        </w:rPr>
+        <w:t>['</w:t>
+      </w:r>
+      <w:r>
+        <w:rPr>
+          <w:rFonts w:hint="eastAsia"/>
+          <w:color w:val="00B0F0"/>
+        </w:rPr>
+        <w:t>计算机科学与信息系统</w:t>
+      </w:r>
+      <w:r>
+        <w:rPr>
+          <w:rFonts w:hint="eastAsia"/>
+          <w:color w:val="00B0F0"/>
+        </w:rPr>
+        <w:t>', '</w:t>
+      </w:r>
+      <w:r>
+        <w:rPr>
+          <w:rFonts w:hint="eastAsia"/>
+          <w:color w:val="00B0F0"/>
+        </w:rPr>
+        <w:t>生物科学</w:t>
+      </w:r>
+      <w:r>
+        <w:rPr>
+          <w:rFonts w:hint="eastAsia"/>
+          <w:color w:val="00B0F0"/>
+        </w:rPr>
+        <w:t>', '</w:t>
+      </w:r>
+      <w:r>
+        <w:rPr>
+          <w:rFonts w:hint="eastAsia"/>
+          <w:color w:val="00B0F0"/>
+        </w:rPr>
+        <w:t>农业与林业</w:t>
+      </w:r>
+      <w:r>
+        <w:rPr>
+          <w:rFonts w:hint="eastAsia"/>
+          <w:color w:val="00B0F0"/>
+        </w:rPr>
+        <w:t>']</w:t>
+      </w:r>
+    </w:p>
+    <w:p>
+      <w:pPr>
+        <w:rPr>
+          <w:color w:val="FF0000"/>
+        </w:rPr>
+      </w:pPr>
+    </w:p>
+    <w:p>
+      <w:pPr>
+        <w:rPr>
+          <w:color w:val="00B0F0"/>
+        </w:rPr>
+      </w:pPr>
+    </w:p>
+    <w:p>
+      <w:pPr>
+        <w:rPr>
+          <w:color w:val="00B0F0"/>
+        </w:rPr>
+      </w:pPr>
+      <w:r>
+        <w:rPr>
+          <w:rFonts w:hint="eastAsia"/>
+          <w:color w:val="FF0000"/>
+        </w:rPr>
         <w:t>采集到的有关学生的其他信息如下：</w:t>
       </w:r>
       <w:r>
@@ -3128,7 +3767,20 @@
           <w:rFonts w:hint="eastAsia"/>
           <w:color w:val="FF0000"/>
         </w:rPr>
-        <w:t>向量搜索出来的专业大类为：</w:t>
+        <w:t>向量搜索出来的专业大类为</w:t>
+      </w:r>
+      <w:r>
+        <w:rPr>
+          <w:color w:val="FF0000"/>
+        </w:rPr>
+        <w:t>(embedding model1)</w:t>
+      </w:r>
+      <w:r>
+        <w:rPr>
+          <w:rFonts w:hint="eastAsia"/>
+          <w:color w:val="FF0000"/>
+        </w:rPr>
+        <w:t>：</w:t>
       </w:r>
       <w:r>
         <w:rPr>
@@ -3198,7 +3850,32 @@
           <w:rFonts w:hint="eastAsia"/>
           <w:color w:val="FF0000"/>
         </w:rPr>
-        <w:t>向量搜索出来的专业小类为：</w:t>
+        <w:t>向量搜索出来的专业大类为</w:t>
+      </w:r>
+      <w:r>
+        <w:rPr>
+          <w:color w:val="FF0000"/>
+        </w:rPr>
+        <w:t>(embedding model</w:t>
+      </w:r>
+      <w:r>
+        <w:rPr>
+          <w:color w:val="FF0000"/>
+        </w:rPr>
+        <w:t>2</w:t>
+      </w:r>
+      <w:r>
+        <w:rPr>
+          <w:color w:val="FF0000"/>
+        </w:rPr>
+        <w:t>)</w:t>
+      </w:r>
+      <w:r>
+        <w:rPr>
+          <w:rFonts w:hint="eastAsia"/>
+          <w:color w:val="FF0000"/>
+        </w:rPr>
+        <w:t>：</w:t>
       </w:r>
       <w:r>
         <w:rPr>
@@ -3219,6 +3896,103 @@
           <w:rFonts w:hint="eastAsia"/>
           <w:color w:val="00B0F0"/>
         </w:rPr>
+        <w:t>教育与培训</w:t>
+      </w:r>
+      <w:r>
+        <w:rPr>
+          <w:rFonts w:hint="eastAsia"/>
+          <w:color w:val="00B0F0"/>
+        </w:rPr>
+        <w:t>', '</w:t>
+      </w:r>
+      <w:r>
+        <w:rPr>
+          <w:rFonts w:hint="eastAsia"/>
+          <w:color w:val="00B0F0"/>
+        </w:rPr>
+        <w:t>计算机科学与信息系统</w:t>
+      </w:r>
+      <w:r>
+        <w:rPr>
+          <w:rFonts w:hint="eastAsia"/>
+          <w:color w:val="00B0F0"/>
+        </w:rPr>
+        <w:t>', '</w:t>
+      </w:r>
+      <w:r>
+        <w:rPr>
+          <w:rFonts w:hint="eastAsia"/>
+          <w:color w:val="00B0F0"/>
+        </w:rPr>
+        <w:t>物理学与天文学</w:t>
+      </w:r>
+      <w:r>
+        <w:rPr>
+          <w:rFonts w:hint="eastAsia"/>
+          <w:color w:val="00B0F0"/>
+        </w:rPr>
+        <w:t>']</w:t>
+      </w:r>
+    </w:p>
+    <w:p>
+      <w:pPr>
+        <w:rPr>
+          <w:color w:val="00B0F0"/>
+        </w:rPr>
+      </w:pPr>
+    </w:p>
+    <w:p>
+      <w:pPr>
+        <w:rPr>
+          <w:color w:val="00B0F0"/>
+        </w:rPr>
+      </w:pPr>
+      <w:r>
+        <w:rPr>
+          <w:rFonts w:hint="eastAsia"/>
+          <w:color w:val="FF0000"/>
+        </w:rPr>
+        <w:t>向量搜索出来的专业小类为</w:t>
+      </w:r>
+      <w:r>
+        <w:rPr>
+          <w:rFonts w:hint="eastAsia"/>
+          <w:color w:val="FF0000"/>
+        </w:rPr>
+        <w:t>(</w:t>
+      </w:r>
+      <w:r>
+        <w:rPr>
+          <w:color w:val="FF0000"/>
+        </w:rPr>
+        <w:t>embedding model1)</w:t>
+      </w:r>
+      <w:r>
+        <w:rPr>
+          <w:rFonts w:hint="eastAsia"/>
+          <w:color w:val="FF0000"/>
+        </w:rPr>
+        <w:t>：</w:t>
+      </w:r>
+      <w:r>
+        <w:rPr>
+          <w:rFonts w:hint="eastAsia"/>
+          <w:color w:val="00B0F0"/>
+        </w:rPr>
+        <w:t xml:space="preserve"> </w:t>
+      </w:r>
+      <w:r>
+        <w:rPr>
+          <w:rFonts w:hint="eastAsia"/>
+          <w:color w:val="00B0F0"/>
+        </w:rPr>
+        <w:t>['</w:t>
+      </w:r>
+      <w:r>
+        <w:rPr>
+          <w:rFonts w:hint="eastAsia"/>
+          <w:color w:val="00B0F0"/>
+        </w:rPr>
         <w:t>电气与电子工程</w:t>
       </w:r>
       <w:r>
@@ -3256,6 +4030,115 @@
         </w:rPr>
         <w:t>']</w:t>
       </w:r>
+    </w:p>
+    <w:p>
+      <w:pPr>
+        <w:rPr>
+          <w:color w:val="00B0F0"/>
+        </w:rPr>
+      </w:pPr>
+      <w:r>
+        <w:rPr>
+          <w:rFonts w:hint="eastAsia"/>
+          <w:color w:val="FF0000"/>
+        </w:rPr>
+        <w:t>向量搜索出来的专业小类为</w:t>
+      </w:r>
+      <w:r>
+        <w:rPr>
+          <w:rFonts w:hint="eastAsia"/>
+          <w:color w:val="FF0000"/>
+        </w:rPr>
+        <w:t>(</w:t>
+      </w:r>
+      <w:r>
+        <w:rPr>
+          <w:color w:val="FF0000"/>
+        </w:rPr>
+        <w:t>embedding model</w:t>
+      </w:r>
+      <w:r>
+        <w:rPr>
+          <w:color w:val="FF0000"/>
+        </w:rPr>
+        <w:t>2</w:t>
+      </w:r>
+      <w:r>
+        <w:rPr>
+          <w:color w:val="FF0000"/>
+        </w:rPr>
+        <w:t>)</w:t>
+      </w:r>
+      <w:r>
+        <w:rPr>
+          <w:rFonts w:hint="eastAsia"/>
+          <w:color w:val="FF0000"/>
+        </w:rPr>
+        <w:t>：</w:t>
+      </w:r>
+      <w:r>
+        <w:rPr>
+          <w:rFonts w:hint="eastAsia"/>
+          <w:color w:val="00B0F0"/>
+        </w:rPr>
+        <w:t xml:space="preserve"> </w:t>
+      </w:r>
+      <w:r>
+        <w:rPr>
+          <w:rFonts w:hint="eastAsia"/>
+          <w:color w:val="00B0F0"/>
+        </w:rPr>
+        <w:t>['</w:t>
+      </w:r>
+      <w:r>
+        <w:rPr>
+          <w:rFonts w:hint="eastAsia"/>
+          <w:color w:val="00B0F0"/>
+        </w:rPr>
+        <w:t>机械、航空与制造工程</w:t>
+      </w:r>
+      <w:r>
+        <w:rPr>
+          <w:rFonts w:hint="eastAsia"/>
+          <w:color w:val="00B0F0"/>
+        </w:rPr>
+        <w:t>', '</w:t>
+      </w:r>
+      <w:r>
+        <w:rPr>
+          <w:rFonts w:hint="eastAsia"/>
+          <w:color w:val="00B0F0"/>
+        </w:rPr>
+        <w:t>计算机科学与信息系统</w:t>
+      </w:r>
+      <w:r>
+        <w:rPr>
+          <w:rFonts w:hint="eastAsia"/>
+          <w:color w:val="00B0F0"/>
+        </w:rPr>
+        <w:t>', '</w:t>
+      </w:r>
+      <w:r>
+        <w:rPr>
+          <w:rFonts w:hint="eastAsia"/>
+          <w:color w:val="00B0F0"/>
+        </w:rPr>
+        <w:t>物理学与天文学</w:t>
+      </w:r>
+      <w:r>
+        <w:rPr>
+          <w:rFonts w:hint="eastAsia"/>
+          <w:color w:val="00B0F0"/>
+        </w:rPr>
+        <w:t>']</w:t>
+      </w:r>
+    </w:p>
+    <w:p>
+      <w:pPr>
+        <w:rPr>
+          <w:color w:val="00B0F0"/>
+        </w:rPr>
+      </w:pPr>
     </w:p>
     <w:p>
       <w:pPr>
@@ -3330,7 +4213,6 @@
     <w:p>
       <w:pPr>
         <w:rPr>
-          <w:rFonts w:hint="eastAsia"/>
           <w:color w:val="00B0F0"/>
         </w:rPr>
       </w:pPr>
@@ -3402,7 +4284,27 @@
           <w:rFonts w:hint="eastAsia"/>
           <w:color w:val="FF0000"/>
         </w:rPr>
-        <w:t>类为：</w:t>
+        <w:t>类为</w:t>
+      </w:r>
+      <w:r>
+        <w:rPr>
+          <w:rFonts w:hint="eastAsia"/>
+          <w:color w:val="FF0000"/>
+        </w:rPr>
+        <w:t>(</w:t>
+      </w:r>
+      <w:r>
+        <w:rPr>
+          <w:color w:val="FF0000"/>
+        </w:rPr>
+        <w:t>embedding model1)</w:t>
+      </w:r>
+      <w:r>
+        <w:rPr>
+          <w:rFonts w:hint="eastAsia"/>
+          <w:color w:val="FF0000"/>
+        </w:rPr>
+        <w:t>：</w:t>
       </w:r>
       <w:r>
         <w:rPr>
@@ -3460,6 +4362,122 @@
           <w:color w:val="00B0F0"/>
         </w:rPr>
       </w:pPr>
+      <w:r>
+        <w:rPr>
+          <w:rFonts w:hint="eastAsia"/>
+          <w:color w:val="FF0000"/>
+        </w:rPr>
+        <w:t>向量搜索出来的对应专业</w:t>
+      </w:r>
+      <w:r>
+        <w:rPr>
+          <w:rFonts w:hint="eastAsia"/>
+          <w:color w:val="FF0000"/>
+        </w:rPr>
+        <w:t>大</w:t>
+      </w:r>
+      <w:r>
+        <w:rPr>
+          <w:rFonts w:hint="eastAsia"/>
+          <w:color w:val="FF0000"/>
+        </w:rPr>
+        <w:t>类为</w:t>
+      </w:r>
+      <w:r>
+        <w:rPr>
+          <w:rFonts w:hint="eastAsia"/>
+          <w:color w:val="FF0000"/>
+        </w:rPr>
+        <w:t>(</w:t>
+      </w:r>
+      <w:r>
+        <w:rPr>
+          <w:color w:val="FF0000"/>
+        </w:rPr>
+        <w:t>embedding model</w:t>
+      </w:r>
+      <w:r>
+        <w:rPr>
+          <w:color w:val="FF0000"/>
+        </w:rPr>
+        <w:t>2</w:t>
+      </w:r>
+      <w:r>
+        <w:rPr>
+          <w:color w:val="FF0000"/>
+        </w:rPr>
+        <w:t>)</w:t>
+      </w:r>
+      <w:r>
+        <w:rPr>
+          <w:rFonts w:hint="eastAsia"/>
+          <w:color w:val="FF0000"/>
+        </w:rPr>
+        <w:t>：</w:t>
+      </w:r>
+      <w:r>
+        <w:rPr>
+          <w:rFonts w:hint="eastAsia"/>
+          <w:color w:val="00B0F0"/>
+        </w:rPr>
+        <w:t>['</w:t>
+      </w:r>
+      <w:r>
+        <w:rPr>
+          <w:rFonts w:hint="eastAsia"/>
+          <w:color w:val="00B0F0"/>
+        </w:rPr>
+        <w:t>商业与管理研究</w:t>
+      </w:r>
+      <w:r>
+        <w:rPr>
+          <w:rFonts w:hint="eastAsia"/>
+          <w:color w:val="00B0F0"/>
+        </w:rPr>
+        <w:t>', '</w:t>
+      </w:r>
+      <w:r>
+        <w:rPr>
+          <w:rFonts w:hint="eastAsia"/>
+          <w:color w:val="00B0F0"/>
+        </w:rPr>
+        <w:t>会计与金融</w:t>
+      </w:r>
+      <w:r>
+        <w:rPr>
+          <w:rFonts w:hint="eastAsia"/>
+          <w:color w:val="00B0F0"/>
+        </w:rPr>
+        <w:t>', '</w:t>
+      </w:r>
+      <w:r>
+        <w:rPr>
+          <w:rFonts w:hint="eastAsia"/>
+          <w:color w:val="00B0F0"/>
+        </w:rPr>
+        <w:t>数学</w:t>
+      </w:r>
+      <w:r>
+        <w:rPr>
+          <w:rFonts w:hint="eastAsia"/>
+          <w:color w:val="00B0F0"/>
+        </w:rPr>
+        <w:t>']</w:t>
+      </w:r>
+    </w:p>
+    <w:p>
+      <w:pPr>
+        <w:rPr>
+          <w:color w:val="00B0F0"/>
+        </w:rPr>
+      </w:pPr>
+    </w:p>
+    <w:p>
+      <w:pPr>
+        <w:rPr>
+          <w:color w:val="00B0F0"/>
+        </w:rPr>
+      </w:pPr>
     </w:p>
     <w:p>
       <w:pPr>
@@ -3710,7 +4728,27 @@
           <w:rFonts w:hint="eastAsia"/>
           <w:color w:val="FF0000"/>
         </w:rPr>
-        <w:t>向量搜索出来的专业大类为：</w:t>
+        <w:t>向量搜索出来的专业大类为</w:t>
+      </w:r>
+      <w:r>
+        <w:rPr>
+          <w:rFonts w:hint="eastAsia"/>
+          <w:color w:val="FF0000"/>
+        </w:rPr>
+        <w:t>(</w:t>
+      </w:r>
+      <w:r>
+        <w:rPr>
+          <w:color w:val="FF0000"/>
+        </w:rPr>
+        <w:t>embedding model1)</w:t>
+      </w:r>
+      <w:r>
+        <w:rPr>
+          <w:rFonts w:hint="eastAsia"/>
+          <w:color w:val="FF0000"/>
+        </w:rPr>
+        <w:t>：</w:t>
       </w:r>
       <w:r>
         <w:rPr>
@@ -3780,7 +4818,39 @@
           <w:rFonts w:hint="eastAsia"/>
           <w:color w:val="FF0000"/>
         </w:rPr>
-        <w:t>向量搜索出来的专业小类为：</w:t>
+        <w:t>向量搜索出来的专业大类为</w:t>
+      </w:r>
+      <w:r>
+        <w:rPr>
+          <w:rFonts w:hint="eastAsia"/>
+          <w:color w:val="FF0000"/>
+        </w:rPr>
+        <w:t>(</w:t>
+      </w:r>
+      <w:r>
+        <w:rPr>
+          <w:color w:val="FF0000"/>
+        </w:rPr>
+        <w:t>embedding model</w:t>
+      </w:r>
+      <w:r>
+        <w:rPr>
+          <w:color w:val="FF0000"/>
+        </w:rPr>
+        <w:t>2</w:t>
+      </w:r>
+      <w:r>
+        <w:rPr>
+          <w:color w:val="FF0000"/>
+        </w:rPr>
+        <w:t>)</w:t>
+      </w:r>
+      <w:r>
+        <w:rPr>
+          <w:rFonts w:hint="eastAsia"/>
+          <w:color w:val="FF0000"/>
+        </w:rPr>
+        <w:t>：</w:t>
       </w:r>
       <w:r>
         <w:rPr>
@@ -3801,6 +4871,34 @@
           <w:rFonts w:hint="eastAsia"/>
           <w:color w:val="00B0F0"/>
         </w:rPr>
+        <w:t>商业与管理研究</w:t>
+      </w:r>
+      <w:r>
+        <w:rPr>
+          <w:rFonts w:hint="eastAsia"/>
+          <w:color w:val="00B0F0"/>
+        </w:rPr>
+        <w:t>', '</w:t>
+      </w:r>
+      <w:r>
+        <w:rPr>
+          <w:rFonts w:hint="eastAsia"/>
+          <w:color w:val="00B0F0"/>
+        </w:rPr>
+        <w:t>经济学与计量经济学</w:t>
+      </w:r>
+      <w:r>
+        <w:rPr>
+          <w:rFonts w:hint="eastAsia"/>
+          <w:color w:val="00B0F0"/>
+        </w:rPr>
+        <w:t>', '</w:t>
+      </w:r>
+      <w:r>
+        <w:rPr>
+          <w:rFonts w:hint="eastAsia"/>
+          <w:color w:val="00B0F0"/>
+        </w:rPr>
         <w:t>会计与金融</w:t>
       </w:r>
       <w:r>
@@ -3808,6 +4906,75 @@
           <w:rFonts w:hint="eastAsia"/>
           <w:color w:val="00B0F0"/>
         </w:rPr>
+        <w:t>']</w:t>
+      </w:r>
+    </w:p>
+    <w:p>
+      <w:pPr>
+        <w:rPr>
+          <w:color w:val="00B0F0"/>
+        </w:rPr>
+      </w:pPr>
+    </w:p>
+    <w:p>
+      <w:pPr>
+        <w:rPr>
+          <w:color w:val="00B0F0"/>
+        </w:rPr>
+      </w:pPr>
+      <w:r>
+        <w:rPr>
+          <w:rFonts w:hint="eastAsia"/>
+          <w:color w:val="FF0000"/>
+        </w:rPr>
+        <w:t>向量搜索出来的专业小类为</w:t>
+      </w:r>
+      <w:r>
+        <w:rPr>
+          <w:rFonts w:hint="eastAsia"/>
+          <w:color w:val="FF0000"/>
+        </w:rPr>
+        <w:t>(</w:t>
+      </w:r>
+      <w:r>
+        <w:rPr>
+          <w:color w:val="FF0000"/>
+        </w:rPr>
+        <w:t>embedding model1)</w:t>
+      </w:r>
+      <w:r>
+        <w:rPr>
+          <w:rFonts w:hint="eastAsia"/>
+          <w:color w:val="FF0000"/>
+        </w:rPr>
+        <w:t>：</w:t>
+      </w:r>
+      <w:r>
+        <w:rPr>
+          <w:rFonts w:hint="eastAsia"/>
+          <w:color w:val="00B0F0"/>
+        </w:rPr>
+        <w:t xml:space="preserve"> </w:t>
+      </w:r>
+      <w:r>
+        <w:rPr>
+          <w:rFonts w:hint="eastAsia"/>
+          <w:color w:val="00B0F0"/>
+        </w:rPr>
+        <w:t>['</w:t>
+      </w:r>
+      <w:r>
+        <w:rPr>
+          <w:rFonts w:hint="eastAsia"/>
+          <w:color w:val="00B0F0"/>
+        </w:rPr>
+        <w:t>会计与金融</w:t>
+      </w:r>
+      <w:r>
+        <w:rPr>
+          <w:rFonts w:hint="eastAsia"/>
+          <w:color w:val="00B0F0"/>
+        </w:rPr>
         <w:t>', '</w:t>
       </w:r>
       <w:r>
@@ -3838,6 +5005,115 @@
         </w:rPr>
         <w:t>']</w:t>
       </w:r>
+    </w:p>
+    <w:p>
+      <w:pPr>
+        <w:rPr>
+          <w:color w:val="00B0F0"/>
+        </w:rPr>
+      </w:pPr>
+      <w:r>
+        <w:rPr>
+          <w:rFonts w:hint="eastAsia"/>
+          <w:color w:val="FF0000"/>
+        </w:rPr>
+        <w:t>向量搜索出来的专业小类为</w:t>
+      </w:r>
+      <w:r>
+        <w:rPr>
+          <w:rFonts w:hint="eastAsia"/>
+          <w:color w:val="FF0000"/>
+        </w:rPr>
+        <w:t>(</w:t>
+      </w:r>
+      <w:r>
+        <w:rPr>
+          <w:color w:val="FF0000"/>
+        </w:rPr>
+        <w:t>embedding model</w:t>
+      </w:r>
+      <w:r>
+        <w:rPr>
+          <w:color w:val="FF0000"/>
+        </w:rPr>
+        <w:t>2</w:t>
+      </w:r>
+      <w:r>
+        <w:rPr>
+          <w:color w:val="FF0000"/>
+        </w:rPr>
+        <w:t>)</w:t>
+      </w:r>
+      <w:r>
+        <w:rPr>
+          <w:rFonts w:hint="eastAsia"/>
+          <w:color w:val="FF0000"/>
+        </w:rPr>
+        <w:t>：</w:t>
+      </w:r>
+      <w:r>
+        <w:rPr>
+          <w:rFonts w:hint="eastAsia"/>
+          <w:color w:val="00B0F0"/>
+        </w:rPr>
+        <w:t xml:space="preserve"> </w:t>
+      </w:r>
+      <w:r>
+        <w:rPr>
+          <w:rFonts w:hint="eastAsia"/>
+          <w:color w:val="00B0F0"/>
+        </w:rPr>
+        <w:t>['</w:t>
+      </w:r>
+      <w:r>
+        <w:rPr>
+          <w:rFonts w:hint="eastAsia"/>
+          <w:color w:val="00B0F0"/>
+        </w:rPr>
+        <w:t>会计与金融</w:t>
+      </w:r>
+      <w:r>
+        <w:rPr>
+          <w:rFonts w:hint="eastAsia"/>
+          <w:color w:val="00B0F0"/>
+        </w:rPr>
+        <w:t>', '</w:t>
+      </w:r>
+      <w:r>
+        <w:rPr>
+          <w:rFonts w:hint="eastAsia"/>
+          <w:color w:val="00B0F0"/>
+        </w:rPr>
+        <w:t>市场营销</w:t>
+      </w:r>
+      <w:r>
+        <w:rPr>
+          <w:rFonts w:hint="eastAsia"/>
+          <w:color w:val="00B0F0"/>
+        </w:rPr>
+        <w:t>', '</w:t>
+      </w:r>
+      <w:r>
+        <w:rPr>
+          <w:rFonts w:hint="eastAsia"/>
+          <w:color w:val="00B0F0"/>
+        </w:rPr>
+        <w:t>教育与培训</w:t>
+      </w:r>
+      <w:r>
+        <w:rPr>
+          <w:rFonts w:hint="eastAsia"/>
+          <w:color w:val="00B0F0"/>
+        </w:rPr>
+        <w:t>']</w:t>
+      </w:r>
+    </w:p>
+    <w:p>
+      <w:pPr>
+        <w:rPr>
+          <w:color w:val="00B0F0"/>
+        </w:rPr>
+      </w:pPr>
     </w:p>
     <w:p>
       <w:pPr>
@@ -3962,7 +5238,27 @@
           <w:rFonts w:hint="eastAsia"/>
           <w:color w:val="FF0000"/>
         </w:rPr>
-        <w:t>向量搜索出来的对应专业小类为：</w:t>
+        <w:t>向量搜索出来的对应专业小类为</w:t>
+      </w:r>
+      <w:r>
+        <w:rPr>
+          <w:rFonts w:hint="eastAsia"/>
+          <w:color w:val="FF0000"/>
+        </w:rPr>
+        <w:t>(</w:t>
+      </w:r>
+      <w:r>
+        <w:rPr>
+          <w:color w:val="FF0000"/>
+        </w:rPr>
+        <w:t>embedding model1)</w:t>
+      </w:r>
+      <w:r>
+        <w:rPr>
+          <w:rFonts w:hint="eastAsia"/>
+          <w:color w:val="FF0000"/>
+        </w:rPr>
+        <w:t>：</w:t>
       </w:r>
       <w:r>
         <w:rPr>
@@ -4027,6 +5323,115 @@
           <w:color w:val="00B0F0"/>
         </w:rPr>
       </w:pPr>
+      <w:r>
+        <w:rPr>
+          <w:rFonts w:hint="eastAsia"/>
+          <w:color w:val="FF0000"/>
+        </w:rPr>
+        <w:t>向量搜索出来的对应专业小类为</w:t>
+      </w:r>
+      <w:r>
+        <w:rPr>
+          <w:rFonts w:hint="eastAsia"/>
+          <w:color w:val="FF0000"/>
+        </w:rPr>
+        <w:t>(</w:t>
+      </w:r>
+      <w:r>
+        <w:rPr>
+          <w:color w:val="FF0000"/>
+        </w:rPr>
+        <w:t>embedding model</w:t>
+      </w:r>
+      <w:r>
+        <w:rPr>
+          <w:color w:val="FF0000"/>
+        </w:rPr>
+        <w:t>2</w:t>
+      </w:r>
+      <w:r>
+        <w:rPr>
+          <w:color w:val="FF0000"/>
+        </w:rPr>
+        <w:t>)</w:t>
+      </w:r>
+      <w:r>
+        <w:rPr>
+          <w:rFonts w:hint="eastAsia"/>
+          <w:color w:val="FF0000"/>
+        </w:rPr>
+        <w:t>：</w:t>
+      </w:r>
+      <w:r>
+        <w:rPr>
+          <w:rFonts w:hint="eastAsia"/>
+          <w:color w:val="00B0F0"/>
+        </w:rPr>
+        <w:t xml:space="preserve"> </w:t>
+      </w:r>
+      <w:r>
+        <w:rPr>
+          <w:rFonts w:hint="eastAsia"/>
+          <w:color w:val="00B0F0"/>
+        </w:rPr>
+        <w:t>['</w:t>
+      </w:r>
+      <w:r>
+        <w:rPr>
+          <w:rFonts w:hint="eastAsia"/>
+          <w:color w:val="00B0F0"/>
+        </w:rPr>
+        <w:t>艺术与设计</w:t>
+      </w:r>
+      <w:r>
+        <w:rPr>
+          <w:rFonts w:hint="eastAsia"/>
+          <w:color w:val="00B0F0"/>
+        </w:rPr>
+        <w:t>', '</w:t>
+      </w:r>
+      <w:r>
+        <w:rPr>
+          <w:rFonts w:hint="eastAsia"/>
+          <w:color w:val="00B0F0"/>
+        </w:rPr>
+        <w:t>建筑与建筑环境</w:t>
+      </w:r>
+      <w:r>
+        <w:rPr>
+          <w:rFonts w:hint="eastAsia"/>
+          <w:color w:val="00B0F0"/>
+        </w:rPr>
+        <w:t>', '</w:t>
+      </w:r>
+      <w:r>
+        <w:rPr>
+          <w:rFonts w:hint="eastAsia"/>
+          <w:color w:val="00B0F0"/>
+        </w:rPr>
+        <w:t>表演艺术</w:t>
+      </w:r>
+      <w:r>
+        <w:rPr>
+          <w:rFonts w:hint="eastAsia"/>
+          <w:color w:val="00B0F0"/>
+        </w:rPr>
+        <w:t>']</w:t>
+      </w:r>
+    </w:p>
+    <w:p>
+      <w:pPr>
+        <w:rPr>
+          <w:color w:val="00B0F0"/>
+        </w:rPr>
+      </w:pPr>
+    </w:p>
+    <w:p>
+      <w:pPr>
+        <w:rPr>
+          <w:color w:val="00B0F0"/>
+        </w:rPr>
+      </w:pPr>
     </w:p>
     <w:p>
       <w:pPr>
@@ -4074,7 +5479,6 @@
           <w:rFonts w:hint="eastAsia"/>
           <w:color w:val="FF0000"/>
         </w:rPr>
-        <w:lastRenderedPageBreak/>
         <w:t>采集到的有关学生的其他信息如下：</w:t>
       </w:r>
       <w:r>
@@ -4215,7 +5619,27 @@
           <w:rFonts w:hint="eastAsia"/>
           <w:color w:val="FF0000"/>
         </w:rPr>
-        <w:t>向量搜索出来的专业大类为：</w:t>
+        <w:t>向量搜索出来的专业大类为</w:t>
+      </w:r>
+      <w:r>
+        <w:rPr>
+          <w:rFonts w:hint="eastAsia"/>
+          <w:color w:val="FF0000"/>
+        </w:rPr>
+        <w:t>(</w:t>
+      </w:r>
+      <w:r>
+        <w:rPr>
+          <w:color w:val="FF0000"/>
+        </w:rPr>
+        <w:t>embedding model1)</w:t>
+      </w:r>
+      <w:r>
+        <w:rPr>
+          <w:rFonts w:hint="eastAsia"/>
+          <w:color w:val="FF0000"/>
+        </w:rPr>
+        <w:t>：</w:t>
       </w:r>
       <w:r>
         <w:rPr>
@@ -4271,7 +5695,224 @@
           <w:rFonts w:hint="eastAsia"/>
           <w:color w:val="FF0000"/>
         </w:rPr>
-        <w:t>向量搜索出来的专业小类为：</w:t>
+        <w:t>向量搜索出来的专业大类为</w:t>
+      </w:r>
+      <w:r>
+        <w:rPr>
+          <w:rFonts w:hint="eastAsia"/>
+          <w:color w:val="FF0000"/>
+        </w:rPr>
+        <w:t>(</w:t>
+      </w:r>
+      <w:r>
+        <w:rPr>
+          <w:color w:val="FF0000"/>
+        </w:rPr>
+        <w:t>embedding model</w:t>
+      </w:r>
+      <w:r>
+        <w:rPr>
+          <w:color w:val="FF0000"/>
+        </w:rPr>
+        <w:t>2</w:t>
+      </w:r>
+      <w:r>
+        <w:rPr>
+          <w:color w:val="FF0000"/>
+        </w:rPr>
+        <w:t>)</w:t>
+      </w:r>
+      <w:r>
+        <w:rPr>
+          <w:rFonts w:hint="eastAsia"/>
+          <w:color w:val="FF0000"/>
+        </w:rPr>
+        <w:t>：</w:t>
+      </w:r>
+      <w:r>
+        <w:rPr>
+          <w:rFonts w:hint="eastAsia"/>
+          <w:color w:val="00B0F0"/>
+        </w:rPr>
+        <w:t xml:space="preserve"> </w:t>
+      </w:r>
+      <w:r>
+        <w:rPr>
+          <w:rFonts w:hint="eastAsia"/>
+          <w:color w:val="00B0F0"/>
+        </w:rPr>
+        <w:t>['</w:t>
+      </w:r>
+      <w:r>
+        <w:rPr>
+          <w:rFonts w:hint="eastAsia"/>
+          <w:color w:val="00B0F0"/>
+        </w:rPr>
+        <w:t>音乐</w:t>
+      </w:r>
+      <w:r>
+        <w:rPr>
+          <w:rFonts w:hint="eastAsia"/>
+          <w:color w:val="00B0F0"/>
+        </w:rPr>
+        <w:t>', '</w:t>
+      </w:r>
+      <w:r>
+        <w:rPr>
+          <w:rFonts w:hint="eastAsia"/>
+          <w:color w:val="00B0F0"/>
+        </w:rPr>
+        <w:t>建筑与建筑环境</w:t>
+      </w:r>
+      <w:r>
+        <w:rPr>
+          <w:rFonts w:hint="eastAsia"/>
+          <w:color w:val="00B0F0"/>
+        </w:rPr>
+        <w:t>', '</w:t>
+      </w:r>
+      <w:r>
+        <w:rPr>
+          <w:rFonts w:hint="eastAsia"/>
+          <w:color w:val="00B0F0"/>
+        </w:rPr>
+        <w:t>艺术与设计</w:t>
+      </w:r>
+      <w:r>
+        <w:rPr>
+          <w:rFonts w:hint="eastAsia"/>
+          <w:color w:val="00B0F0"/>
+        </w:rPr>
+        <w:t>']</w:t>
+      </w:r>
+    </w:p>
+    <w:p>
+      <w:pPr>
+        <w:rPr>
+          <w:color w:val="00B0F0"/>
+        </w:rPr>
+      </w:pPr>
+    </w:p>
+    <w:p>
+      <w:pPr>
+        <w:rPr>
+          <w:color w:val="00B0F0"/>
+        </w:rPr>
+      </w:pPr>
+      <w:r>
+        <w:rPr>
+          <w:rFonts w:hint="eastAsia"/>
+          <w:color w:val="FF0000"/>
+        </w:rPr>
+        <w:t>向量搜索出来的专业小类为</w:t>
+      </w:r>
+      <w:r>
+        <w:rPr>
+          <w:rFonts w:hint="eastAsia"/>
+          <w:color w:val="FF0000"/>
+        </w:rPr>
+        <w:t>(</w:t>
+      </w:r>
+      <w:r>
+        <w:rPr>
+          <w:color w:val="FF0000"/>
+        </w:rPr>
+        <w:t>embedding model1)</w:t>
+      </w:r>
+      <w:r>
+        <w:rPr>
+          <w:rFonts w:hint="eastAsia"/>
+          <w:color w:val="FF0000"/>
+        </w:rPr>
+        <w:t>：</w:t>
+      </w:r>
+      <w:r>
+        <w:rPr>
+          <w:rFonts w:hint="eastAsia"/>
+          <w:color w:val="00B0F0"/>
+        </w:rPr>
+        <w:t xml:space="preserve"> </w:t>
+      </w:r>
+      <w:r>
+        <w:rPr>
+          <w:rFonts w:hint="eastAsia"/>
+          <w:color w:val="00B0F0"/>
+        </w:rPr>
+        <w:t>['</w:t>
+      </w:r>
+      <w:r>
+        <w:rPr>
+          <w:rFonts w:hint="eastAsia"/>
+          <w:color w:val="00B0F0"/>
+        </w:rPr>
+        <w:t>艺术与设计</w:t>
+      </w:r>
+      <w:r>
+        <w:rPr>
+          <w:rFonts w:hint="eastAsia"/>
+          <w:color w:val="00B0F0"/>
+        </w:rPr>
+        <w:t>', '</w:t>
+      </w:r>
+      <w:r>
+        <w:rPr>
+          <w:rFonts w:hint="eastAsia"/>
+          <w:color w:val="00B0F0"/>
+        </w:rPr>
+        <w:t>建筑与建筑环境</w:t>
+      </w:r>
+      <w:r>
+        <w:rPr>
+          <w:rFonts w:hint="eastAsia"/>
+          <w:color w:val="00B0F0"/>
+        </w:rPr>
+        <w:t>']</w:t>
+      </w:r>
+    </w:p>
+    <w:p>
+      <w:pPr>
+        <w:rPr>
+          <w:color w:val="00B0F0"/>
+        </w:rPr>
+      </w:pPr>
+      <w:r>
+        <w:rPr>
+          <w:rFonts w:hint="eastAsia"/>
+          <w:color w:val="FF0000"/>
+        </w:rPr>
+        <w:t>向量搜索出来的专业小类为</w:t>
+      </w:r>
+      <w:r>
+        <w:rPr>
+          <w:rFonts w:hint="eastAsia"/>
+          <w:color w:val="FF0000"/>
+        </w:rPr>
+        <w:t>(</w:t>
+      </w:r>
+      <w:r>
+        <w:rPr>
+          <w:color w:val="FF0000"/>
+        </w:rPr>
+        <w:t>embedding model</w:t>
+      </w:r>
+      <w:r>
+        <w:rPr>
+          <w:color w:val="FF0000"/>
+        </w:rPr>
+        <w:t>2</w:t>
+      </w:r>
+      <w:r>
+        <w:rPr>
+          <w:color w:val="FF0000"/>
+        </w:rPr>
+        <w:t>)</w:t>
+      </w:r>
+      <w:r>
+        <w:rPr>
+          <w:rFonts w:hint="eastAsia"/>
+          <w:color w:val="FF0000"/>
+        </w:rPr>
+        <w:t>：</w:t>
       </w:r>
       <w:r>
         <w:rPr>
@@ -4460,7 +6101,27 @@
           <w:rFonts w:hint="eastAsia"/>
           <w:color w:val="FF0000"/>
         </w:rPr>
-        <w:t>类为：</w:t>
+        <w:t>类为</w:t>
+      </w:r>
+      <w:r>
+        <w:rPr>
+          <w:rFonts w:hint="eastAsia"/>
+          <w:color w:val="FF0000"/>
+        </w:rPr>
+        <w:t>(</w:t>
+      </w:r>
+      <w:r>
+        <w:rPr>
+          <w:color w:val="FF0000"/>
+        </w:rPr>
+        <w:t>embedding model 1)</w:t>
+      </w:r>
+      <w:r>
+        <w:rPr>
+          <w:rFonts w:hint="eastAsia"/>
+          <w:color w:val="FF0000"/>
+        </w:rPr>
+        <w:t>：</w:t>
       </w:r>
       <w:r>
         <w:rPr>
@@ -4518,6 +6179,122 @@
           <w:color w:val="00B0F0"/>
         </w:rPr>
       </w:pPr>
+      <w:r>
+        <w:rPr>
+          <w:rFonts w:hint="eastAsia"/>
+          <w:color w:val="FF0000"/>
+        </w:rPr>
+        <w:t>向量搜索出来的对应专业</w:t>
+      </w:r>
+      <w:r>
+        <w:rPr>
+          <w:rFonts w:hint="eastAsia"/>
+          <w:color w:val="FF0000"/>
+        </w:rPr>
+        <w:t>大</w:t>
+      </w:r>
+      <w:r>
+        <w:rPr>
+          <w:rFonts w:hint="eastAsia"/>
+          <w:color w:val="FF0000"/>
+        </w:rPr>
+        <w:t>类为</w:t>
+      </w:r>
+      <w:r>
+        <w:rPr>
+          <w:rFonts w:hint="eastAsia"/>
+          <w:color w:val="FF0000"/>
+        </w:rPr>
+        <w:t>(</w:t>
+      </w:r>
+      <w:r>
+        <w:rPr>
+          <w:color w:val="FF0000"/>
+        </w:rPr>
+        <w:t xml:space="preserve">embedding model </w:t>
+      </w:r>
+      <w:r>
+        <w:rPr>
+          <w:color w:val="FF0000"/>
+        </w:rPr>
+        <w:t>2</w:t>
+      </w:r>
+      <w:r>
+        <w:rPr>
+          <w:color w:val="FF0000"/>
+        </w:rPr>
+        <w:t>)</w:t>
+      </w:r>
+      <w:r>
+        <w:rPr>
+          <w:rFonts w:hint="eastAsia"/>
+          <w:color w:val="FF0000"/>
+        </w:rPr>
+        <w:t>：</w:t>
+      </w:r>
+      <w:r>
+        <w:rPr>
+          <w:rFonts w:hint="eastAsia"/>
+          <w:color w:val="00B0F0"/>
+        </w:rPr>
+        <w:t>['</w:t>
+      </w:r>
+      <w:r>
+        <w:rPr>
+          <w:rFonts w:hint="eastAsia"/>
+          <w:color w:val="00B0F0"/>
+        </w:rPr>
+        <w:t>计算机科学与信息系统</w:t>
+      </w:r>
+      <w:r>
+        <w:rPr>
+          <w:rFonts w:hint="eastAsia"/>
+          <w:color w:val="00B0F0"/>
+        </w:rPr>
+        <w:t>', '</w:t>
+      </w:r>
+      <w:r>
+        <w:rPr>
+          <w:rFonts w:hint="eastAsia"/>
+          <w:color w:val="00B0F0"/>
+        </w:rPr>
+        <w:t>电气与电子工程</w:t>
+      </w:r>
+      <w:r>
+        <w:rPr>
+          <w:rFonts w:hint="eastAsia"/>
+          <w:color w:val="00B0F0"/>
+        </w:rPr>
+        <w:t>', '</w:t>
+      </w:r>
+      <w:r>
+        <w:rPr>
+          <w:rFonts w:hint="eastAsia"/>
+          <w:color w:val="00B0F0"/>
+        </w:rPr>
+        <w:t>数学</w:t>
+      </w:r>
+      <w:r>
+        <w:rPr>
+          <w:rFonts w:hint="eastAsia"/>
+          <w:color w:val="00B0F0"/>
+        </w:rPr>
+        <w:t>']</w:t>
+      </w:r>
+    </w:p>
+    <w:p>
+      <w:pPr>
+        <w:rPr>
+          <w:color w:val="00B0F0"/>
+        </w:rPr>
+      </w:pPr>
+    </w:p>
+    <w:p>
+      <w:pPr>
+        <w:rPr>
+          <w:color w:val="00B0F0"/>
+        </w:rPr>
+      </w:pPr>
     </w:p>
     <w:p>
       <w:pPr>
@@ -4784,12 +6561,21 @@
         </w:rPr>
         <w:t>③</w:t>
       </w:r>
-      <w:r>
-        <w:rPr>
-          <w:rFonts w:hint="eastAsia"/>
-          <w:color w:val="00B0F0"/>
-        </w:rPr>
-        <w:t xml:space="preserve">Orzel, How to Teach Quantum Physics to your Dog </w:t>
+      <w:proofErr w:type="spellStart"/>
+      <w:r>
+        <w:rPr>
+          <w:rFonts w:hint="eastAsia"/>
+          <w:color w:val="00B0F0"/>
+        </w:rPr>
+        <w:t>Orzel</w:t>
+      </w:r>
+      <w:proofErr w:type="spellEnd"/>
+      <w:r>
+        <w:rPr>
+          <w:rFonts w:hint="eastAsia"/>
+          <w:color w:val="00B0F0"/>
+        </w:rPr>
+        <w:t xml:space="preserve">, How to Teach Quantum Physics to your Dog </w:t>
       </w:r>
       <w:r>
         <w:rPr>
@@ -4852,7 +6638,28 @@
           <w:rFonts w:hint="eastAsia"/>
           <w:color w:val="FF0000"/>
         </w:rPr>
-        <w:t>向量搜索出来的专业大类为：</w:t>
+        <w:lastRenderedPageBreak/>
+        <w:t>向量搜索出来的专业大类为</w:t>
+      </w:r>
+      <w:r>
+        <w:rPr>
+          <w:rFonts w:hint="eastAsia"/>
+          <w:color w:val="FF0000"/>
+        </w:rPr>
+        <w:t>(</w:t>
+      </w:r>
+      <w:r>
+        <w:rPr>
+          <w:color w:val="FF0000"/>
+        </w:rPr>
+        <w:t>embedding model 1)</w:t>
+      </w:r>
+      <w:r>
+        <w:rPr>
+          <w:rFonts w:hint="eastAsia"/>
+          <w:color w:val="FF0000"/>
+        </w:rPr>
+        <w:t>：</w:t>
       </w:r>
       <w:r>
         <w:rPr>
@@ -4922,7 +6729,39 @@
           <w:rFonts w:hint="eastAsia"/>
           <w:color w:val="FF0000"/>
         </w:rPr>
-        <w:t>向量搜索出来的专业小类为：</w:t>
+        <w:t>向量搜索出来的专业大类为</w:t>
+      </w:r>
+      <w:r>
+        <w:rPr>
+          <w:rFonts w:hint="eastAsia"/>
+          <w:color w:val="FF0000"/>
+        </w:rPr>
+        <w:t>(</w:t>
+      </w:r>
+      <w:r>
+        <w:rPr>
+          <w:color w:val="FF0000"/>
+        </w:rPr>
+        <w:t xml:space="preserve">embedding model </w:t>
+      </w:r>
+      <w:r>
+        <w:rPr>
+          <w:color w:val="FF0000"/>
+        </w:rPr>
+        <w:t>2</w:t>
+      </w:r>
+      <w:r>
+        <w:rPr>
+          <w:color w:val="FF0000"/>
+        </w:rPr>
+        <w:t>)</w:t>
+      </w:r>
+      <w:r>
+        <w:rPr>
+          <w:rFonts w:hint="eastAsia"/>
+          <w:color w:val="FF0000"/>
+        </w:rPr>
+        <w:t>：</w:t>
       </w:r>
       <w:r>
         <w:rPr>
@@ -4957,6 +6796,103 @@
           <w:rFonts w:hint="eastAsia"/>
           <w:color w:val="00B0F0"/>
         </w:rPr>
+        <w:t>机械、航空与制造工程</w:t>
+      </w:r>
+      <w:r>
+        <w:rPr>
+          <w:rFonts w:hint="eastAsia"/>
+          <w:color w:val="00B0F0"/>
+        </w:rPr>
+        <w:t>', '</w:t>
+      </w:r>
+      <w:r>
+        <w:rPr>
+          <w:rFonts w:hint="eastAsia"/>
+          <w:color w:val="00B0F0"/>
+        </w:rPr>
+        <w:t>计算机科学与信息系统</w:t>
+      </w:r>
+      <w:r>
+        <w:rPr>
+          <w:rFonts w:hint="eastAsia"/>
+          <w:color w:val="00B0F0"/>
+        </w:rPr>
+        <w:t>']</w:t>
+      </w:r>
+    </w:p>
+    <w:p>
+      <w:pPr>
+        <w:rPr>
+          <w:color w:val="00B0F0"/>
+        </w:rPr>
+      </w:pPr>
+    </w:p>
+    <w:p>
+      <w:pPr>
+        <w:rPr>
+          <w:color w:val="00B0F0"/>
+        </w:rPr>
+      </w:pPr>
+      <w:r>
+        <w:rPr>
+          <w:rFonts w:hint="eastAsia"/>
+          <w:color w:val="FF0000"/>
+        </w:rPr>
+        <w:t>向量搜索出来的专业小类为</w:t>
+      </w:r>
+      <w:r>
+        <w:rPr>
+          <w:rFonts w:hint="eastAsia"/>
+          <w:color w:val="FF0000"/>
+        </w:rPr>
+        <w:t>(</w:t>
+      </w:r>
+      <w:r>
+        <w:rPr>
+          <w:color w:val="FF0000"/>
+        </w:rPr>
+        <w:t>embedding model1)</w:t>
+      </w:r>
+      <w:r>
+        <w:rPr>
+          <w:rFonts w:hint="eastAsia"/>
+          <w:color w:val="FF0000"/>
+        </w:rPr>
+        <w:t>：</w:t>
+      </w:r>
+      <w:r>
+        <w:rPr>
+          <w:rFonts w:hint="eastAsia"/>
+          <w:color w:val="00B0F0"/>
+        </w:rPr>
+        <w:t xml:space="preserve"> </w:t>
+      </w:r>
+      <w:r>
+        <w:rPr>
+          <w:rFonts w:hint="eastAsia"/>
+          <w:color w:val="00B0F0"/>
+        </w:rPr>
+        <w:t>['</w:t>
+      </w:r>
+      <w:r>
+        <w:rPr>
+          <w:rFonts w:hint="eastAsia"/>
+          <w:color w:val="00B0F0"/>
+        </w:rPr>
+        <w:t>物理学与天文学</w:t>
+      </w:r>
+      <w:r>
+        <w:rPr>
+          <w:rFonts w:hint="eastAsia"/>
+          <w:color w:val="00B0F0"/>
+        </w:rPr>
+        <w:t>', '</w:t>
+      </w:r>
+      <w:r>
+        <w:rPr>
+          <w:rFonts w:hint="eastAsia"/>
+          <w:color w:val="00B0F0"/>
+        </w:rPr>
         <w:t>材料科学</w:t>
       </w:r>
       <w:r>
@@ -4970,7 +6906,101 @@
     <w:p>
       <w:pPr>
         <w:rPr>
-          <w:rFonts w:hint="eastAsia"/>
+          <w:color w:val="00B0F0"/>
+        </w:rPr>
+      </w:pPr>
+      <w:r>
+        <w:rPr>
+          <w:rFonts w:hint="eastAsia"/>
+          <w:color w:val="FF0000"/>
+        </w:rPr>
+        <w:t>向量搜索出来的专业小类为</w:t>
+      </w:r>
+      <w:r>
+        <w:rPr>
+          <w:rFonts w:hint="eastAsia"/>
+          <w:color w:val="FF0000"/>
+        </w:rPr>
+        <w:t>(</w:t>
+      </w:r>
+      <w:r>
+        <w:rPr>
+          <w:color w:val="FF0000"/>
+        </w:rPr>
+        <w:t>embedding model</w:t>
+      </w:r>
+      <w:r>
+        <w:rPr>
+          <w:color w:val="FF0000"/>
+        </w:rPr>
+        <w:t>2</w:t>
+      </w:r>
+      <w:r>
+        <w:rPr>
+          <w:color w:val="FF0000"/>
+        </w:rPr>
+        <w:t>)</w:t>
+      </w:r>
+      <w:r>
+        <w:rPr>
+          <w:rFonts w:hint="eastAsia"/>
+          <w:color w:val="FF0000"/>
+        </w:rPr>
+        <w:t>：</w:t>
+      </w:r>
+      <w:r>
+        <w:rPr>
+          <w:rFonts w:hint="eastAsia"/>
+          <w:color w:val="00B0F0"/>
+        </w:rPr>
+        <w:t xml:space="preserve"> </w:t>
+      </w:r>
+      <w:r>
+        <w:rPr>
+          <w:rFonts w:hint="eastAsia"/>
+          <w:color w:val="00B0F0"/>
+        </w:rPr>
+        <w:t>['</w:t>
+      </w:r>
+      <w:r>
+        <w:rPr>
+          <w:rFonts w:hint="eastAsia"/>
+          <w:color w:val="00B0F0"/>
+        </w:rPr>
+        <w:t>物理学与天文学</w:t>
+      </w:r>
+      <w:r>
+        <w:rPr>
+          <w:rFonts w:hint="eastAsia"/>
+          <w:color w:val="00B0F0"/>
+        </w:rPr>
+        <w:t>', '</w:t>
+      </w:r>
+      <w:r>
+        <w:rPr>
+          <w:rFonts w:hint="eastAsia"/>
+          <w:color w:val="00B0F0"/>
+        </w:rPr>
+        <w:t>材料科学</w:t>
+      </w:r>
+      <w:r>
+        <w:rPr>
+          <w:rFonts w:hint="eastAsia"/>
+          <w:color w:val="00B0F0"/>
+        </w:rPr>
+        <w:t>']</w:t>
+      </w:r>
+    </w:p>
+    <w:p>
+      <w:pPr>
+        <w:rPr>
+          <w:color w:val="00B0F0"/>
+        </w:rPr>
+      </w:pPr>
+    </w:p>
+    <w:p>
+      <w:pPr>
+        <w:rPr>
           <w:color w:val="00B0F0"/>
         </w:rPr>
       </w:pPr>

</xml_diff>